<commit_message>
Made some changes to checkin report.
Former-commit-id: 5c7ba853e621cf765d0c91a0d6906baedb804b8d
</commit_message>
<xml_diff>
--- a/Checkins/CheckinReport v0.4.1_2April2018.docx
+++ b/Checkins/CheckinReport v0.4.1_2April2018.docx
@@ -9,8 +9,6 @@
       <w:r>
         <w:t>April 2</w:t>
       </w:r>
-      <w:bookmarkStart w:id="0" w:name="_GoBack"/>
-      <w:bookmarkEnd w:id="0"/>
       <w:r>
         <w:t>, 2018</w:t>
       </w:r>
@@ -184,22 +182,8 @@
       <w:r>
         <w:t>This version of SE has work on load performance and query performance.</w:t>
       </w:r>
-    </w:p>
-    <w:p>
-      <w:r>
-        <w:t>Would like to know if JIRA 306 is reproducible with this version.</w:t>
-      </w:r>
-    </w:p>
-    <w:p>
-      <w:r>
-        <w:t xml:space="preserve">Also, whether </w:t>
-      </w:r>
-      <w:r>
-        <w:t>SE crashes during regression with this version.</w:t>
-      </w:r>
-      <w:r>
-        <w:t xml:space="preserve"> </w:t>
-      </w:r>
+      <w:bookmarkStart w:id="0" w:name="_GoBack"/>
+      <w:bookmarkEnd w:id="0"/>
     </w:p>
     <w:sectPr>
       <w:pgSz w:w="12240" w:h="15840"/>

</xml_diff>